<commit_message>
Standardise page headers and clean up remaining em dashes
- New shared PageHeader component (icon + kicker + serif title
  + optional description and actions) matching the Tool Scanner style
- Apply to Requirements, Contexts, Platforms, Users, Evaluations,
  Results, FAQ, Profile, and Tool Scanner so all pages share one
  visual idiom
- Results layout: ExportButtons moved into PageHeader actions slot;
  sticky tab nav and filter strip preserved
- Remove em dashes from FAQ metadata, prisma schema comments, and
  the explainer docs; rebuild About-SPACE.docx to match
- Fix stale scoring-scale comments in lib/scoring.ts and
  prisma/schema.prisma (was 1-5/1-3, actually 1-4)
</commit_message>
<xml_diff>
--- a/docs/About-SPACE.docx
+++ b/docs/About-SPACE.docx
@@ -179,7 +179,7 @@
           <w:bCs/>
           <w:color w:val="1A4731"/>
         </w:rPr>
-        <w:t xml:space="preserve">Layer 1: Tool Scanner, the fast triage</w:t>
+        <w:t xml:space="preserve">Layer 1: Tool Scanner (the fast triage)</w:t>
       </w:r>
     </w:p>
     <w:p>
@@ -351,7 +351,7 @@
           <w:bCs/>
           <w:color w:val="1A4731"/>
         </w:rPr>
-        <w:t xml:space="preserve">Layer 2: Tool Evaluator, the deliberate human review</w:t>
+        <w:t xml:space="preserve">Layer 2: Tool Evaluator (the deliberate human review)</w:t>
       </w:r>
     </w:p>
     <w:p>

</xml_diff>